<commit_message>
docs: phase-plan docx to 2026-07-16 — 10/16 complete, live on clavira.in
Phases 11 (engagement) and 15 (deploy) marked completed; overview, register,
phase details and the client-inputs table updated (hosting/domain delivered,
SMTP mailbox credentials now the remaining email-delivery input).

Co-Authored-By: Claude Opus 4.8 <noreply@anthropic.com>
</commit_message>
<xml_diff>
--- a/docs/Clavira-Project-Phases.docx
+++ b/docs/Clavira-Project-Phases.docx
@@ -175,7 +175,7 @@
                 <w:sz w:val="19"/>
                 <w:szCs w:val="19"/>
               </w:rPr>
-              <w:t xml:space="preserve">15 July 2026</w:t>
+              <w:t xml:space="preserve">16 July 2026</w:t>
             </w:r>
           </w:p>
         </w:tc>
@@ -240,7 +240,7 @@
                 <w:sz w:val="19"/>
                 <w:szCs w:val="19"/>
               </w:rPr>
-              <w:t xml:space="preserve">8 of 16 phases complete · 2 in progress · live on a temporary domain</w:t>
+              <w:t xml:space="preserve">10 of 16 phases complete · 1 in progress · LIVE on clavira.in</w:t>
             </w:r>
           </w:p>
         </w:tc>
@@ -370,7 +370,7 @@
                 <w:sz w:val="19"/>
                 <w:szCs w:val="19"/>
               </w:rPr>
-              <w:t xml:space="preserve">C:\xampp2\htdocs\clavira  —  commit adcedc6 (branch main)</w:t>
+              <w:t xml:space="preserve">C:\xampp2\htdocs\clavira  —  commit c5e216d (branch dev)</w:t>
             </w:r>
           </w:p>
         </w:tc>
@@ -457,7 +457,7 @@
           <w:sz w:val="21"/>
           <w:szCs w:val="21"/>
         </w:rPr>
-        <w:t xml:space="preserve">Clavira is a luxury jewellery e-commerce storefront for the Indian market, engineered to expand to NRI customers without re-architecture. Groundwork (brochure and reference-site analysis, and the stack decision) is complete; the build itself is organised into 16 phases. Phases 1–6, 8 and 9 are done and verified — including a hardened invite-only admin-access system and a branded email pipeline — and the site is live on a temporary Hostinger domain. Phase 7 (content) and Phase 15 (deploy) are partially complete; Phase 11 (engagement) is next. Each phase is discussed and marked below.</w:t>
+        <w:t xml:space="preserve">Clavira is a luxury jewellery e-commerce storefront for the Indian market, engineered to expand to NRI customers without re-architecture. Groundwork (brochure and reference-site analysis, and the stack decision) is complete; the build itself is organised into 16 phases. Phases 1–6, 8, 9, 11 and 15 are done and verified — including a hardened invite-only admin-access system, a branded email pipeline, the engagement suite and the production deployment — and the site is LIVE on the real domain, clavira.in, with automatic deploys. Phase 7 (content) awaits client materials; Phase 10 (payments) awaits live Razorpay keys. Each phase is discussed and marked below.</w:t>
       </w:r>
     </w:p>
     <w:p>
@@ -2136,12 +2136,12 @@
                 <w:i w:val="false"/>
                 <w:iCs w:val="false"/>
                 <w:caps/>
-                <w:color w:val="9A7233"/>
+                <w:color w:val="55632F"/>
                 <w:spacing w:val="20"/>
                 <w:sz w:val="16"/>
                 <w:szCs w:val="16"/>
               </w:rPr>
-              <w:t xml:space="preserve">NEXT UP</w:t>
+              <w:t xml:space="preserve">✓  COMPLETED</w:t>
             </w:r>
           </w:p>
         </w:tc>
@@ -2532,12 +2532,12 @@
                 <w:i w:val="false"/>
                 <w:iCs w:val="false"/>
                 <w:caps/>
-                <w:color w:val="3F6B6B"/>
+                <w:color w:val="55632F"/>
                 <w:spacing w:val="20"/>
                 <w:sz w:val="16"/>
                 <w:szCs w:val="16"/>
               </w:rPr>
-              <w:t xml:space="preserve">IN PROGRESS</w:t>
+              <w:t xml:space="preserve">✓  COMPLETED</w:t>
             </w:r>
           </w:p>
         </w:tc>
@@ -2658,7 +2658,7 @@
           <w:sz w:val="20"/>
           <w:szCs w:val="20"/>
         </w:rPr>
-        <w:t xml:space="preserve">8 of 16 phases complete · 2 in progress.</w:t>
+        <w:t xml:space="preserve">10 of 16 phases complete · 1 in progress.</w:t>
       </w:r>
     </w:p>
     <w:p>
@@ -3905,7 +3905,7 @@
           <w:sz w:val="21"/>
           <w:szCs w:val="21"/>
         </w:rPr>
-        <w:t xml:space="preserve">Live on a temporary Hostinger domain via cron auto-pull deploy scripts. Build log and roadmap documented under docs/.</w:t>
+        <w:t xml:space="preserve">Live via cron auto-pull deploy scripts — now serving the real domain clavira.in. Build log and roadmap documented under docs/.</w:t>
       </w:r>
     </w:p>
     <w:p>
@@ -4787,12 +4787,12 @@
                 <w:i w:val="false"/>
                 <w:iCs w:val="false"/>
                 <w:caps/>
-                <w:color w:val="9A7233"/>
+                <w:color w:val="55632F"/>
                 <w:spacing w:val="20"/>
                 <w:sz w:val="16"/>
                 <w:szCs w:val="16"/>
               </w:rPr>
-              <w:t xml:space="preserve">NEXT UP</w:t>
+              <w:t xml:space="preserve">✓  COMPLETED</w:t>
             </w:r>
           </w:p>
         </w:tc>
@@ -4814,7 +4814,7 @@
           <w:sz w:val="21"/>
           <w:szCs w:val="21"/>
         </w:rPr>
-        <w:t xml:space="preserve">Features that turn browsers into buyers — especially valuable for high-consideration jewellery. In progress now.</w:t>
+        <w:t xml:space="preserve">Features that turn browsers into buyers — especially valuable for high-consideration jewellery. Delivered and verified end-to-end.</w:t>
       </w:r>
     </w:p>
     <w:p>
@@ -4838,7 +4838,7 @@
           <w:sz w:val="21"/>
           <w:szCs w:val="21"/>
         </w:rPr>
-        <w:t xml:space="preserve">WhatsApp enquiry button; virtual-consultation / appointment booking.</w:t>
+        <w:t xml:space="preserve">Floating WhatsApp enquiry button; consultation / appointment booking (virtual, atelier, bridal &amp; bespoke).</w:t>
       </w:r>
     </w:p>
     <w:p>
@@ -4862,7 +4862,7 @@
           <w:sz w:val="21"/>
           <w:szCs w:val="21"/>
         </w:rPr>
-        <w:t xml:space="preserve">Product reviews &amp; ratings (moderated); newsletter capture.</w:t>
+        <w:t xml:space="preserve">Moderated product reviews &amp; ratings live on product pages; newsletter capture in the footer.</w:t>
       </w:r>
     </w:p>
     <w:p>
@@ -4886,7 +4886,7 @@
           <w:sz w:val="21"/>
           <w:szCs w:val="21"/>
         </w:rPr>
-        <w:t xml:space="preserve">Custom-design / made-to-order request flow.</w:t>
+        <w:t xml:space="preserve">Admin moderation pages for reviews and consultations; bespoke consultations carry made-to-order requests.</w:t>
       </w:r>
     </w:p>
     <w:p>
@@ -5567,12 +5567,12 @@
                 <w:i w:val="false"/>
                 <w:iCs w:val="false"/>
                 <w:caps/>
-                <w:color w:val="3F6B6B"/>
+                <w:color w:val="55632F"/>
                 <w:spacing w:val="20"/>
                 <w:sz w:val="16"/>
                 <w:szCs w:val="16"/>
               </w:rPr>
-              <w:t xml:space="preserve">IN PROGRESS</w:t>
+              <w:t xml:space="preserve">✓  COMPLETED</w:t>
             </w:r>
           </w:p>
         </w:tc>
@@ -5594,7 +5594,7 @@
           <w:sz w:val="21"/>
           <w:szCs w:val="21"/>
         </w:rPr>
-        <w:t xml:space="preserve">Publishing the site. Already live on a temporary domain; the real domain and production secrets remain.</w:t>
+        <w:t xml:space="preserve">Published. The store is live on the real domain clavira.in with SSL and automatic deploys.</w:t>
       </w:r>
     </w:p>
     <w:p>
@@ -5618,7 +5618,7 @@
           <w:sz w:val="21"/>
           <w:szCs w:val="21"/>
         </w:rPr>
-        <w:t xml:space="preserve">Done: GitHub remote, vendor/build shipped via git, dev → main → cron auto-pull pipeline, live on a temporary Hostinger domain.</w:t>
+        <w:t xml:space="preserve">GitHub remote, vendor/build shipped via git, dev → main → cron auto-pull pipeline (deploys within 5 minutes).</w:t>
       </w:r>
     </w:p>
     <w:p>
@@ -5642,7 +5642,7 @@
           <w:sz w:val="21"/>
           <w:szCs w:val="21"/>
         </w:rPr>
-        <w:t xml:space="preserve">Needs you: point the real domain; set production secrets in .env (Razorpay keys, SMTP credentials, admin owner allowlist); confirm SSL and the auto-pull cron.</w:t>
+        <w:t xml:space="preserve">Live on clavira.in with SSL (incl. www); sessions configured for the domain; owner admin logins provisioned &amp; verified; legacy default admin removed. Remaining: Razorpay keys (Phase 10) and SMTP mailbox credentials.</w:t>
       </w:r>
     </w:p>
     <w:p>
@@ -5860,7 +5860,7 @@
           <w:sz w:val="21"/>
           <w:szCs w:val="21"/>
         </w:rPr>
-        <w:t xml:space="preserve">Three inputs unblock every gated phase. In the meantime, Phases 8 (Admin), 9 (Accounts &amp; Wishlist) and 11 (Engagement) can all proceed.</w:t>
+        <w:t xml:space="preserve">Three inputs unblock every gated phase. In the meantime, Phases 12 (SEO &amp; PWA), 13 (NRI) and 14 (QA &amp; accessibility) can all proceed.</w:t>
       </w:r>
     </w:p>
     <w:tbl>
@@ -6202,7 +6202,7 @@
                 <w:sz w:val="18"/>
                 <w:szCs w:val="18"/>
               </w:rPr>
-              <w:t xml:space="preserve">Hosting &amp; domain</w:t>
+              <w:t xml:space="preserve">SMTP mailbox credentials</w:t>
             </w:r>
           </w:p>
         </w:tc>
@@ -6233,7 +6233,7 @@
                 <w:sz w:val="18"/>
                 <w:szCs w:val="18"/>
               </w:rPr>
-              <w:t xml:space="preserve">Hostinger git remote / SSH and the domain (or a temporary subdomain).</w:t>
+              <w:t xml:space="preserve">A mailbox (e.g. noreply@clavira.in) created in hPanel; credentials set in the server .env — never shared in chat.</w:t>
             </w:r>
           </w:p>
         </w:tc>
@@ -6264,7 +6264,7 @@
                 <w:sz w:val="18"/>
                 <w:szCs w:val="18"/>
               </w:rPr>
-              <w:t xml:space="preserve">Deployment (Phase 15)</w:t>
+              <w:t xml:space="preserve">Email delivery (invites, login alerts, order emails)</w:t>
             </w:r>
           </w:p>
         </w:tc>
@@ -6286,7 +6286,7 @@
           <w:sz w:val="19"/>
           <w:szCs w:val="19"/>
         </w:rPr>
-        <w:t xml:space="preserve">Suggested order: Phase 8 (Admin) → Phase 9 (Accounts &amp; Wishlist) → Phase 11 (Engagement) can start now; Phases 7, 10 and 15 run in parallel as inputs arrive.</w:t>
+        <w:t xml:space="preserve">Suggested order: Phase 12 (SEO &amp; PWA) → Phase 14 (QA &amp; accessibility) → Phase 13 (NRI) can start now; Phases 7 and 10 complete as inputs arrive.</w:t>
       </w:r>
     </w:p>
     <w:sectPr>

</xml_diff>